<commit_message>
feat: implement initial core architecture including AI simulator, service adapters, and modular UI components
</commit_message>
<xml_diff>
--- a/docs/FinGuard_AI_System_Credentials_and_Documentation.docx
+++ b/docs/FinGuard_AI_System_Credentials_and_Documentation.docx
@@ -463,7 +463,7 @@
               <w:rPr>
                 <w:sz w:val="19"/>
               </w:rPr>
-              <w:t>ADMIN-001</w:t>
+              <w:t>ADMIN-001 (Super Admin)</w:t>
             </w:r>
           </w:p>
         </w:tc>
@@ -530,7 +530,7 @@
               <w:rPr>
                 <w:sz w:val="19"/>
               </w:rPr>
-              <w:t>OWNER-METRO-8492</w:t>
+              <w:t>OWNER-METRO-8492 (Business Owner)</w:t>
             </w:r>
           </w:p>
         </w:tc>
@@ -597,7 +597,7 @@
               <w:rPr>
                 <w:sz w:val="19"/>
               </w:rPr>
-              <w:t>accountant@metrosuperstore.com</w:t>
+              <w:t>accountant@metrosuperstore.com (Store Accountant)</w:t>
             </w:r>
           </w:p>
         </w:tc>
@@ -664,7 +664,7 @@
               <w:rPr>
                 <w:sz w:val="19"/>
               </w:rPr>
-              <w:t>manager.store1@metrosuperstore.com</w:t>
+              <w:t>cashier.billing@metrosuperstore.com (Cashier &amp; Billing)</w:t>
             </w:r>
           </w:p>
         </w:tc>
@@ -690,7 +690,7 @@
               <w:rPr>
                 <w:sz w:val="19"/>
               </w:rPr>
-              <w:t>manager.store1@metrosuperstore.com</w:t>
+              <w:t>cashier.billing@metrosuperstore.com</w:t>
             </w:r>
           </w:p>
         </w:tc>
@@ -703,7 +703,7 @@
               <w:rPr>
                 <w:sz w:val="19"/>
               </w:rPr>
-              <w:t>FG-MGR-552</w:t>
+              <w:t>FG-BILL-789</w:t>
             </w:r>
           </w:p>
         </w:tc>
@@ -716,7 +716,7 @@
               <w:rPr>
                 <w:sz w:val="19"/>
               </w:rPr>
-              <w:t>9876534562</w:t>
+              <w:t>9876545673</w:t>
             </w:r>
           </w:p>
         </w:tc>
@@ -731,7 +731,7 @@
               <w:rPr>
                 <w:sz w:val="19"/>
               </w:rPr>
-              <w:t>staff.ops@metrosuperstore.com</w:t>
+              <w:t>manager.stock@metrosuperstore.com (Stock Manager)</w:t>
             </w:r>
           </w:p>
         </w:tc>
@@ -757,7 +757,7 @@
               <w:rPr>
                 <w:sz w:val="19"/>
               </w:rPr>
-              <w:t>staff.ops@metrosuperstore.com</w:t>
+              <w:t>manager.stock@metrosuperstore.com</w:t>
             </w:r>
           </w:p>
         </w:tc>
@@ -770,7 +770,7 @@
               <w:rPr>
                 <w:sz w:val="19"/>
               </w:rPr>
-              <w:t>FG-STAFF-982</w:t>
+              <w:t>FG-STOCK-552</w:t>
             </w:r>
           </w:p>
         </w:tc>
@@ -783,7 +783,7 @@
               <w:rPr>
                 <w:sz w:val="19"/>
               </w:rPr>
-              <w:t>9876545673</w:t>
+              <w:t>9876534562</w:t>
             </w:r>
           </w:p>
         </w:tc>

</xml_diff>